<commit_message>
fix(phase3): remediate independent review P0 auth, v2 evidence re-binding, and PICO/role-number checks
</commit_message>
<xml_diff>
--- a/artifacts/file_roundtrip/job_demo_aurenix_round_1/05_tracked_changes_redline_v1_to_v2.docx
+++ b/artifacts/file_roundtrip/job_demo_aurenix_round_1/05_tracked_changes_redline_v1_to_v2.docx
@@ -29,7 +29,7 @@
       <w:r>
         <w:t xml:space="preserve"> </w:t>
       </w:r>
-      <w:del w:id="100" w:author="sarah.chen@aurenix.example" w:date="2026-10-29T22:18:22Z">
+      <w:del w:id="100" w:author="sarah.chen@aurenix.example" w:date="2026-10-30T11:14:13Z">
         <w:r>
           <w:delText>reduced progression-free survival risk by 38%</w:delText>
         </w:r>
@@ -40,7 +40,7 @@
           <w:delText>†</w:delText>
         </w:r>
       </w:del>
-      <w:ins w:id="101" w:author="sarah.chen@aurenix.example" w:date="2026-10-29T22:18:22Z">
+      <w:ins w:id="101" w:author="sarah.chen@aurenix.example" w:date="2026-10-30T11:14:13Z">
         <w:r>
           <w:t>achieved a statistically significant 38%</w:t>
         </w:r>

</xml_diff>